<commit_message>
auto: Claude 수정사항 반영
</commit_message>
<xml_diff>
--- a/04_신입사원_자기주도학습교재_엔키아이해하기.docx
+++ b/04_신입사원_자기주도학습교재_엔키아이해하기.docx
@@ -24109,6 +24109,14 @@
           <w:highlight w:val="yellow"/>
         </w:rPr>
         <w:t>보유</w:t>
+      </w:r>
+      <w:r>
+        <w:rPr>
+          <w:rFonts w:ascii="맑은 고딕" w:hAnsi="맑은 고딕"/>
+          <w:i/>
+          <w:sz w:val="18"/>
+        </w:rPr>
+        <w:t xml:space="preserve"> (2023년 IR자료 기준. "보유"라는 표현과 현재 거래 중인 고객군을 나열하는 문맥상 현재 시점의 거래 고객사 수로 추정되나, 원본에 "현재" 또는 "누적"이라는 표현이 명시되어 있지는 않습니다. 역대 누적 구축 고객사 수일 가능성도 배제할 수 없어, 정확한 정의는 영업본부·경영지원본부에 확인이 필요합니다.)</w:t>
       </w:r>
     </w:p>
     <w:p>

</xml_diff>